<commit_message>
Episodes 11-101 TTS pacing pass: scene-break spacing replaces 394 spacer paragraphs, 44 system lines sentence-cased with ledger-voice heralds, 6 dashes rewritten, 3 spoken episode-number references fixed (Section 3.10 rollout complete series-wide)
Co-Authored-By: Claude Fable 5 <noreply@anthropic.com>
</commit_message>
<xml_diff>
--- a/episodes/The_Dark_Rise_Episode_100.docx
+++ b/episodes/The_Dark_Rise_Episode_100.docx
@@ -140,20 +140,7 @@
     </w:p>
     <w:p>
       <w:pPr>
-        <w:spacing w:after="0" w:line="360"/>
-      </w:pPr>
-      <w:r>
-        <w:rPr>
-          <w:rFonts w:ascii="Georgia" w:hAnsi="Georgia" w:cs="Georgia"/>
-          <w:sz w:val="24"/>
-          <w:szCs w:val="24"/>
-        </w:rPr>
-        <w:t xml:space="preserve"/>
-      </w:r>
-    </w:p>
-    <w:p>
-      <w:pPr>
-        <w:spacing w:after="60" w:line="360"/>
+        <w:spacing w:after="60" w:line="360" w:before="480"/>
         <w:ind w:firstLine="360"/>
       </w:pPr>
       <w:r>
@@ -223,20 +210,7 @@
     </w:p>
     <w:p>
       <w:pPr>
-        <w:spacing w:after="0" w:line="360"/>
-      </w:pPr>
-      <w:r>
-        <w:rPr>
-          <w:rFonts w:ascii="Georgia" w:hAnsi="Georgia" w:cs="Georgia"/>
-          <w:sz w:val="24"/>
-          <w:szCs w:val="24"/>
-        </w:rPr>
-        <w:t xml:space="preserve"/>
-      </w:r>
-    </w:p>
-    <w:p>
-      <w:pPr>
-        <w:spacing w:after="60" w:line="360"/>
+        <w:spacing w:after="60" w:line="360" w:before="480"/>
         <w:ind w:firstLine="360"/>
       </w:pPr>
       <w:r>

</xml_diff>